<commit_message>
write up document updated
</commit_message>
<xml_diff>
--- a/hr-portal-project/project-write-up.docx
+++ b/hr-portal-project/project-write-up.docx
@@ -604,7 +604,35 @@
           <w:sz w:val="20"/>
           <w:szCs w:val="20"/>
         </w:rPr>
-        <w:t xml:space="preserve">The database already </w:t>
+        <w:t>The database already include</w:t>
+      </w:r>
+      <w:r>
+        <w:rPr>
+          <w:sz w:val="20"/>
+          <w:szCs w:val="20"/>
+        </w:rPr>
+        <w:t>s</w:t>
+      </w:r>
+      <w:r>
+        <w:rPr>
+          <w:sz w:val="20"/>
+          <w:szCs w:val="20"/>
+        </w:rPr>
+        <w:t xml:space="preserve"> two employees, </w:t>
+      </w:r>
+      <w:r>
+        <w:rPr>
+          <w:sz w:val="20"/>
+          <w:szCs w:val="20"/>
+        </w:rPr>
+        <w:t>two processed</w:t>
+      </w:r>
+      <w:r>
+        <w:rPr>
+          <w:sz w:val="20"/>
+          <w:szCs w:val="20"/>
+        </w:rPr>
+        <w:t xml:space="preserve"> leave </w:t>
       </w:r>
       <w:proofErr w:type="gramStart"/>
       <w:r>
@@ -612,7 +640,7 @@
           <w:sz w:val="20"/>
           <w:szCs w:val="20"/>
         </w:rPr>
-        <w:t>include</w:t>
+        <w:t>request</w:t>
       </w:r>
       <w:proofErr w:type="gramEnd"/>
       <w:r>
@@ -620,25 +648,21 @@
           <w:sz w:val="20"/>
           <w:szCs w:val="20"/>
         </w:rPr>
-        <w:t xml:space="preserve"> two employees, one leave request, and one static HR credentials object. To proceed with testing functionality, login as HR (login type) with </w:t>
-      </w:r>
-      <w:proofErr w:type="spellStart"/>
-      <w:proofErr w:type="gramStart"/>
-      <w:r>
-        <w:rPr>
-          <w:sz w:val="20"/>
-          <w:szCs w:val="20"/>
-        </w:rPr>
-        <w:t>he</w:t>
-      </w:r>
-      <w:proofErr w:type="spellEnd"/>
-      <w:proofErr w:type="gramEnd"/>
-      <w:r>
-        <w:rPr>
-          <w:sz w:val="20"/>
-          <w:szCs w:val="20"/>
-        </w:rPr>
-        <w:t xml:space="preserve"> following credentials:</w:t>
+        <w:t xml:space="preserve">, and one static HR credentials object. To proceed with testing functionality, login as HR (login type) with </w:t>
+      </w:r>
+      <w:r>
+        <w:rPr>
+          <w:sz w:val="20"/>
+          <w:szCs w:val="20"/>
+        </w:rPr>
+        <w:t>t</w:t>
+      </w:r>
+      <w:r>
+        <w:rPr>
+          <w:sz w:val="20"/>
+          <w:szCs w:val="20"/>
+        </w:rPr>
+        <w:t>he following credentials:</w:t>
       </w:r>
     </w:p>
     <w:p>
@@ -687,7 +711,21 @@
           <w:sz w:val="20"/>
           <w:szCs w:val="20"/>
         </w:rPr>
-        <w:t>Password: abc1234</w:t>
+        <w:t>Password: abc</w:t>
+      </w:r>
+      <w:r>
+        <w:rPr>
+          <w:sz w:val="20"/>
+          <w:szCs w:val="20"/>
+        </w:rPr>
+        <w:t>d</w:t>
+      </w:r>
+      <w:r>
+        <w:rPr>
+          <w:sz w:val="20"/>
+          <w:szCs w:val="20"/>
+        </w:rPr>
+        <w:t>1234</w:t>
       </w:r>
     </w:p>
     <w:p>

</xml_diff>